<commit_message>
Sharpen RRCP cover letter with direct reanalysis context
</commit_message>
<xml_diff>
--- a/revision/deliverables/RRCP/Cover_letter.docx
+++ b/revision/deliverables/RRCP/Cover_letter.docx
@@ -17,12 +17,12 @@
     </w:p>
     <w:p>
       <w:r>
-        <w:t>We present “Reassessing asthma mortality in Brazil during 2014–2021 through reproduction and age-specific analysis” for consideration as an Original Article. The study examines Brazilian asthma mortality during 2014–2021 using public SIM records and IBGE population projections. It reproduces the earlier analysis and assesses whether crude increases persist after standardisation within national and younger age domains.</w:t>
+        <w:t>We present “Reassessing asthma mortality in Brazil during 2014–2021 through reproduction and age-specific analysis” for consideration as an Original Article. The study examines Brazilian asthma mortality during 2014–2021 using public SIM records and IBGE population projections. It directly reassesses Brum et al., “Recent increase in asthma mortality in Brazil: a warning sign for the public health system” (J Bras Pneumol. 2024;50(5):e20240138; doi:10.36416/1806-3756/e20240138), published by this journal under its former title.</w:t>
       </w:r>
     </w:p>
     <w:p>
       <w:r>
-        <w:t>The work addresses respiratory surveillance in Brazil. It distinguishes changes between endpoints from trends across years, and age composition from age-specific mortality. The national standardised estimate is compatible with trends in either direction. The increase within ages 5–34 over 2014–2021 is interpreted alongside uncertainty in the shorter prepandemic series and sensitivity to modelling assumptions.</w:t>
+        <w:t>The reanalysis shows why the reported national crude increase should be distinguished from the age-standardised trend: the primary national standardised slope is compatible with trends in either direction. Within ages 5–34, standardised mortality increased between the 2014 and 2021 endpoints; the shorter prepandemic series remains inconclusive. These distinctions make the findings directly relevant to respiratory surveillance in Brazil.</w:t>
       </w:r>
     </w:p>
     <w:p>

</xml_diff>